<commit_message>
refactor(auth, user): remove notification logic for user registration and approval status, update TJudul model to include 'ABSTRAK' field, and enhance notification date parsing in views for better user experience
</commit_message>
<xml_diff>
--- a/template/undangan seminar kemajuan TEMPLATE.docx
+++ b/template/undangan seminar kemajuan TEMPLATE.docx
@@ -1,6 +1,6 @@
 
 <file path=word/document.xml><?xml version="1.0" encoding="utf-8"?>
-<w:document xmlns:wpc="http://schemas.microsoft.com/office/word/2010/wordprocessingCanvas" xmlns:cx="http://schemas.microsoft.com/office/drawing/2014/chartex" xmlns:mc="http://schemas.openxmlformats.org/markup-compatibility/2006" xmlns:o="urn:schemas-microsoft-com:office:office" xmlns:r="http://schemas.openxmlformats.org/officeDocument/2006/relationships" xmlns:m="http://schemas.openxmlformats.org/officeDocument/2006/math" xmlns:v="urn:schemas-microsoft-com:vml" xmlns:wp14="http://schemas.microsoft.com/office/word/2010/wordprocessingDrawing" xmlns:wp="http://schemas.openxmlformats.org/drawingml/2006/wordprocessingDrawing" xmlns:w10="urn:schemas-microsoft-com:office:word" xmlns:w="http://schemas.openxmlformats.org/wordprocessingml/2006/main" xmlns:w14="http://schemas.microsoft.com/office/word/2010/wordml" xmlns:w15="http://schemas.microsoft.com/office/word/2012/wordml" xmlns:w16se="http://schemas.microsoft.com/office/word/2015/wordml/symex" xmlns:wpg="http://schemas.microsoft.com/office/word/2010/wordprocessingGroup" xmlns:wpi="http://schemas.microsoft.com/office/word/2010/wordprocessingInk" xmlns:wne="http://schemas.microsoft.com/office/word/2006/wordml" xmlns:wps="http://schemas.microsoft.com/office/word/2010/wordprocessingShape" mc:Ignorable="w14 w15 w16se wp14">
+<w:document xmlns:wpc="http://schemas.microsoft.com/office/word/2010/wordprocessingCanvas" xmlns:cx="http://schemas.microsoft.com/office/drawing/2014/chartex" xmlns:cx1="http://schemas.microsoft.com/office/drawing/2015/9/8/chartex" xmlns:cx2="http://schemas.microsoft.com/office/drawing/2015/10/21/chartex" xmlns:cx3="http://schemas.microsoft.com/office/drawing/2016/5/9/chartex" xmlns:cx4="http://schemas.microsoft.com/office/drawing/2016/5/10/chartex" xmlns:cx5="http://schemas.microsoft.com/office/drawing/2016/5/11/chartex" xmlns:cx6="http://schemas.microsoft.com/office/drawing/2016/5/12/chartex" xmlns:cx7="http://schemas.microsoft.com/office/drawing/2016/5/13/chartex" xmlns:cx8="http://schemas.microsoft.com/office/drawing/2016/5/14/chartex" xmlns:mc="http://schemas.openxmlformats.org/markup-compatibility/2006" xmlns:aink="http://schemas.microsoft.com/office/drawing/2016/ink" xmlns:am3d="http://schemas.microsoft.com/office/drawing/2017/model3d" xmlns:o="urn:schemas-microsoft-com:office:office" xmlns:oel="http://schemas.microsoft.com/office/2019/extlst" xmlns:r="http://schemas.openxmlformats.org/officeDocument/2006/relationships" xmlns:m="http://schemas.openxmlformats.org/officeDocument/2006/math" xmlns:v="urn:schemas-microsoft-com:vml" xmlns:wp14="http://schemas.microsoft.com/office/word/2010/wordprocessingDrawing" xmlns:wp="http://schemas.openxmlformats.org/drawingml/2006/wordprocessingDrawing" xmlns:w10="urn:schemas-microsoft-com:office:word" xmlns:w="http://schemas.openxmlformats.org/wordprocessingml/2006/main" xmlns:w14="http://schemas.microsoft.com/office/word/2010/wordml" xmlns:w15="http://schemas.microsoft.com/office/word/2012/wordml" xmlns:w16cex="http://schemas.microsoft.com/office/word/2018/wordml/cex" xmlns:w16cid="http://schemas.microsoft.com/office/word/2016/wordml/cid" xmlns:w16="http://schemas.microsoft.com/office/word/2018/wordml" xmlns:w16du="http://schemas.microsoft.com/office/word/2023/wordml/word16du" xmlns:w16sdtdh="http://schemas.microsoft.com/office/word/2020/wordml/sdtdatahash" xmlns:w16sdtfl="http://schemas.microsoft.com/office/word/2024/wordml/sdtformatlock" xmlns:w16se="http://schemas.microsoft.com/office/word/2015/wordml/symex" xmlns:wpg="http://schemas.microsoft.com/office/word/2010/wordprocessingGroup" xmlns:wpi="http://schemas.microsoft.com/office/word/2010/wordprocessingInk" xmlns:wne="http://schemas.microsoft.com/office/word/2006/wordml" xmlns:wps="http://schemas.microsoft.com/office/word/2010/wordprocessingShape" mc:Ignorable="w14 w15 w16se w16cid w16 w16cex w16sdtdh w16sdtfl w16du wp14">
   <w:body>
     <w:tbl>
       <w:tblPr>
@@ -46,7 +46,12 @@
               <w:t>Nomor</w:t>
             </w:r>
             <w:r>
-              <w:tab/>
+              <w:rPr>
+                <w:spacing w:val="-2"/>
+              </w:rPr>
+              <w:t xml:space="preserve">       </w:t>
+            </w:r>
+            <w:r>
               <w:t>: ${no_undnagan}</w:t>
             </w:r>
           </w:p>
@@ -183,10 +188,7 @@
         <w:ind w:left="142"/>
       </w:pPr>
       <w:r>
-        <w:t xml:space="preserve">Sehubungan dengan telah disetujuinya Disertasi mahasiswa Program Doktor </w:t>
-      </w:r>
-      <w:r>
-        <w:t>Teknik Geofisika FTTM-ITB,</w:t>
+        <w:t>Sehubungan dengan telah disetujuinya Disertasi mahasiswa Program Doktor Teknik Geofisika FTTM-ITB,</w:t>
       </w:r>
       <w:r>
         <w:rPr>
@@ -1325,7 +1327,6 @@
         <w:rPr>
           <w:u w:val="single"/>
         </w:rPr>
-        <w:lastRenderedPageBreak/>
         <w:t>${nama_wda}</w:t>
       </w:r>
     </w:p>
@@ -1357,8 +1358,6 @@
           <w:sz w:val="20"/>
         </w:rPr>
       </w:pPr>
-      <w:bookmarkStart w:id="0" w:name="_GoBack"/>
-      <w:bookmarkEnd w:id="0"/>
     </w:p>
     <w:sectPr>
       <w:type w:val="continuous"/>
@@ -1371,7 +1370,7 @@
 </file>
 
 <file path=word/endnotes.xml><?xml version="1.0" encoding="utf-8"?>
-<w:endnotes xmlns:wpc="http://schemas.microsoft.com/office/word/2010/wordprocessingCanvas" xmlns:cx="http://schemas.microsoft.com/office/drawing/2014/chartex" xmlns:mc="http://schemas.openxmlformats.org/markup-compatibility/2006" xmlns:o="urn:schemas-microsoft-com:office:office" xmlns:r="http://schemas.openxmlformats.org/officeDocument/2006/relationships" xmlns:m="http://schemas.openxmlformats.org/officeDocument/2006/math" xmlns:v="urn:schemas-microsoft-com:vml" xmlns:wp14="http://schemas.microsoft.com/office/word/2010/wordprocessingDrawing" xmlns:wp="http://schemas.openxmlformats.org/drawingml/2006/wordprocessingDrawing" xmlns:w10="urn:schemas-microsoft-com:office:word" xmlns:w="http://schemas.openxmlformats.org/wordprocessingml/2006/main" xmlns:w14="http://schemas.microsoft.com/office/word/2010/wordml" xmlns:w15="http://schemas.microsoft.com/office/word/2012/wordml" xmlns:w16se="http://schemas.microsoft.com/office/word/2015/wordml/symex" xmlns:wpg="http://schemas.microsoft.com/office/word/2010/wordprocessingGroup" xmlns:wpi="http://schemas.microsoft.com/office/word/2010/wordprocessingInk" xmlns:wne="http://schemas.microsoft.com/office/word/2006/wordml" xmlns:wps="http://schemas.microsoft.com/office/word/2010/wordprocessingShape" mc:Ignorable="w14 w15 w16se wp14">
+<w:endnotes xmlns:wpc="http://schemas.microsoft.com/office/word/2010/wordprocessingCanvas" xmlns:cx="http://schemas.microsoft.com/office/drawing/2014/chartex" xmlns:cx1="http://schemas.microsoft.com/office/drawing/2015/9/8/chartex" xmlns:cx2="http://schemas.microsoft.com/office/drawing/2015/10/21/chartex" xmlns:cx3="http://schemas.microsoft.com/office/drawing/2016/5/9/chartex" xmlns:cx4="http://schemas.microsoft.com/office/drawing/2016/5/10/chartex" xmlns:cx5="http://schemas.microsoft.com/office/drawing/2016/5/11/chartex" xmlns:cx6="http://schemas.microsoft.com/office/drawing/2016/5/12/chartex" xmlns:cx7="http://schemas.microsoft.com/office/drawing/2016/5/13/chartex" xmlns:cx8="http://schemas.microsoft.com/office/drawing/2016/5/14/chartex" xmlns:mc="http://schemas.openxmlformats.org/markup-compatibility/2006" xmlns:aink="http://schemas.microsoft.com/office/drawing/2016/ink" xmlns:am3d="http://schemas.microsoft.com/office/drawing/2017/model3d" xmlns:o="urn:schemas-microsoft-com:office:office" xmlns:oel="http://schemas.microsoft.com/office/2019/extlst" xmlns:r="http://schemas.openxmlformats.org/officeDocument/2006/relationships" xmlns:m="http://schemas.openxmlformats.org/officeDocument/2006/math" xmlns:v="urn:schemas-microsoft-com:vml" xmlns:wp14="http://schemas.microsoft.com/office/word/2010/wordprocessingDrawing" xmlns:wp="http://schemas.openxmlformats.org/drawingml/2006/wordprocessingDrawing" xmlns:w10="urn:schemas-microsoft-com:office:word" xmlns:w="http://schemas.openxmlformats.org/wordprocessingml/2006/main" xmlns:w14="http://schemas.microsoft.com/office/word/2010/wordml" xmlns:w15="http://schemas.microsoft.com/office/word/2012/wordml" xmlns:w16cex="http://schemas.microsoft.com/office/word/2018/wordml/cex" xmlns:w16cid="http://schemas.microsoft.com/office/word/2016/wordml/cid" xmlns:w16="http://schemas.microsoft.com/office/word/2018/wordml" xmlns:w16du="http://schemas.microsoft.com/office/word/2023/wordml/word16du" xmlns:w16sdtdh="http://schemas.microsoft.com/office/word/2020/wordml/sdtdatahash" xmlns:w16sdtfl="http://schemas.microsoft.com/office/word/2024/wordml/sdtformatlock" xmlns:w16se="http://schemas.microsoft.com/office/word/2015/wordml/symex" xmlns:wpg="http://schemas.microsoft.com/office/word/2010/wordprocessingGroup" xmlns:wpi="http://schemas.microsoft.com/office/word/2010/wordprocessingInk" xmlns:wne="http://schemas.microsoft.com/office/word/2006/wordml" xmlns:wps="http://schemas.microsoft.com/office/word/2010/wordprocessingShape" mc:Ignorable="w14 w15 w16se w16cid w16 w16cex w16sdtdh w16sdtfl w16du wp14">
   <w:endnote w:type="separator" w:id="-1">
     <w:p>
       <w:r>
@@ -1390,7 +1389,7 @@
 </file>
 
 <file path=word/footer1.xml><?xml version="1.0" encoding="utf-8"?>
-<w:ftr xmlns:wpc="http://schemas.microsoft.com/office/word/2010/wordprocessingCanvas" xmlns:cx="http://schemas.microsoft.com/office/drawing/2014/chartex" xmlns:mc="http://schemas.openxmlformats.org/markup-compatibility/2006" xmlns:o="urn:schemas-microsoft-com:office:office" xmlns:r="http://schemas.openxmlformats.org/officeDocument/2006/relationships" xmlns:m="http://schemas.openxmlformats.org/officeDocument/2006/math" xmlns:v="urn:schemas-microsoft-com:vml" xmlns:wp14="http://schemas.microsoft.com/office/word/2010/wordprocessingDrawing" xmlns:wp="http://schemas.openxmlformats.org/drawingml/2006/wordprocessingDrawing" xmlns:w10="urn:schemas-microsoft-com:office:word" xmlns:w="http://schemas.openxmlformats.org/wordprocessingml/2006/main" xmlns:w14="http://schemas.microsoft.com/office/word/2010/wordml" xmlns:w15="http://schemas.microsoft.com/office/word/2012/wordml" xmlns:w16se="http://schemas.microsoft.com/office/word/2015/wordml/symex" xmlns:wpg="http://schemas.microsoft.com/office/word/2010/wordprocessingGroup" xmlns:wpi="http://schemas.microsoft.com/office/word/2010/wordprocessingInk" xmlns:wne="http://schemas.microsoft.com/office/word/2006/wordml" xmlns:wps="http://schemas.microsoft.com/office/word/2010/wordprocessingShape" mc:Ignorable="w14 w15 w16se wp14">
+<w:ftr xmlns:wpc="http://schemas.microsoft.com/office/word/2010/wordprocessingCanvas" xmlns:cx="http://schemas.microsoft.com/office/drawing/2014/chartex" xmlns:cx1="http://schemas.microsoft.com/office/drawing/2015/9/8/chartex" xmlns:cx2="http://schemas.microsoft.com/office/drawing/2015/10/21/chartex" xmlns:cx3="http://schemas.microsoft.com/office/drawing/2016/5/9/chartex" xmlns:cx4="http://schemas.microsoft.com/office/drawing/2016/5/10/chartex" xmlns:cx5="http://schemas.microsoft.com/office/drawing/2016/5/11/chartex" xmlns:cx6="http://schemas.microsoft.com/office/drawing/2016/5/12/chartex" xmlns:cx7="http://schemas.microsoft.com/office/drawing/2016/5/13/chartex" xmlns:cx8="http://schemas.microsoft.com/office/drawing/2016/5/14/chartex" xmlns:mc="http://schemas.openxmlformats.org/markup-compatibility/2006" xmlns:aink="http://schemas.microsoft.com/office/drawing/2016/ink" xmlns:am3d="http://schemas.microsoft.com/office/drawing/2017/model3d" xmlns:o="urn:schemas-microsoft-com:office:office" xmlns:oel="http://schemas.microsoft.com/office/2019/extlst" xmlns:r="http://schemas.openxmlformats.org/officeDocument/2006/relationships" xmlns:m="http://schemas.openxmlformats.org/officeDocument/2006/math" xmlns:v="urn:schemas-microsoft-com:vml" xmlns:wp14="http://schemas.microsoft.com/office/word/2010/wordprocessingDrawing" xmlns:wp="http://schemas.openxmlformats.org/drawingml/2006/wordprocessingDrawing" xmlns:w10="urn:schemas-microsoft-com:office:word" xmlns:w="http://schemas.openxmlformats.org/wordprocessingml/2006/main" xmlns:w14="http://schemas.microsoft.com/office/word/2010/wordml" xmlns:w15="http://schemas.microsoft.com/office/word/2012/wordml" xmlns:w16cex="http://schemas.microsoft.com/office/word/2018/wordml/cex" xmlns:w16cid="http://schemas.microsoft.com/office/word/2016/wordml/cid" xmlns:w16="http://schemas.microsoft.com/office/word/2018/wordml" xmlns:w16du="http://schemas.microsoft.com/office/word/2023/wordml/word16du" xmlns:w16sdtdh="http://schemas.microsoft.com/office/word/2020/wordml/sdtdatahash" xmlns:w16sdtfl="http://schemas.microsoft.com/office/word/2024/wordml/sdtformatlock" xmlns:w16se="http://schemas.microsoft.com/office/word/2015/wordml/symex" xmlns:wpg="http://schemas.microsoft.com/office/word/2010/wordprocessingGroup" xmlns:wpi="http://schemas.microsoft.com/office/word/2010/wordprocessingInk" xmlns:wne="http://schemas.microsoft.com/office/word/2006/wordml" xmlns:wps="http://schemas.microsoft.com/office/word/2010/wordprocessingShape" mc:Ignorable="w14 w15 w16se w16cid w16 w16cex w16sdtdh w16sdtfl w16du wp14">
   <w:p>
     <w:pPr>
       <w:pStyle w:val="Footer"/>
@@ -1540,7 +1539,7 @@
         </mc:Choice>
         <mc:Fallback>
           <w:pict>
-            <v:line w14:anchorId="2F9C8216" id="Line 416" o:spid="_x0000_s1026" style="position:absolute;z-index:251657216;visibility:visible;mso-wrap-style:square;mso-width-percent:0;mso-height-percent:0;mso-wrap-distance-left:9pt;mso-wrap-distance-top:0;mso-wrap-distance-right:9pt;mso-wrap-distance-bottom:0;mso-position-horizontal:absolute;mso-position-horizontal-relative:margin;mso-position-vertical:absolute;mso-position-vertical-relative:text;mso-width-percent:0;mso-height-percent:0;mso-width-relative:page;mso-height-relative:page" from="0,0" to="496.05pt,0" o:gfxdata="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" strokecolor="#7f7f7f [1612]" strokeweight="1.5pt">
+            <v:line w14:anchorId="41BCD95A" id="Line 416" o:spid="_x0000_s1026" style="position:absolute;z-index:251657216;visibility:visible;mso-wrap-style:square;mso-width-percent:0;mso-height-percent:0;mso-wrap-distance-left:9pt;mso-wrap-distance-top:0;mso-wrap-distance-right:9pt;mso-wrap-distance-bottom:0;mso-position-horizontal:absolute;mso-position-horizontal-relative:margin;mso-position-vertical:absolute;mso-position-vertical-relative:text;mso-width-percent:0;mso-height-percent:0;mso-width-relative:page;mso-height-relative:page" from="0,0" to="496.05pt,0" o:gfxdata="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" strokecolor="#7f7f7f [1612]" strokeweight="1.5pt">
               <w10:wrap anchorx="margin"/>
             </v:line>
           </w:pict>
@@ -1552,7 +1551,7 @@
 </file>
 
 <file path=word/footnotes.xml><?xml version="1.0" encoding="utf-8"?>
-<w:footnotes xmlns:wpc="http://schemas.microsoft.com/office/word/2010/wordprocessingCanvas" xmlns:cx="http://schemas.microsoft.com/office/drawing/2014/chartex" xmlns:mc="http://schemas.openxmlformats.org/markup-compatibility/2006" xmlns:o="urn:schemas-microsoft-com:office:office" xmlns:r="http://schemas.openxmlformats.org/officeDocument/2006/relationships" xmlns:m="http://schemas.openxmlformats.org/officeDocument/2006/math" xmlns:v="urn:schemas-microsoft-com:vml" xmlns:wp14="http://schemas.microsoft.com/office/word/2010/wordprocessingDrawing" xmlns:wp="http://schemas.openxmlformats.org/drawingml/2006/wordprocessingDrawing" xmlns:w10="urn:schemas-microsoft-com:office:word" xmlns:w="http://schemas.openxmlformats.org/wordprocessingml/2006/main" xmlns:w14="http://schemas.microsoft.com/office/word/2010/wordml" xmlns:w15="http://schemas.microsoft.com/office/word/2012/wordml" xmlns:w16se="http://schemas.microsoft.com/office/word/2015/wordml/symex" xmlns:wpg="http://schemas.microsoft.com/office/word/2010/wordprocessingGroup" xmlns:wpi="http://schemas.microsoft.com/office/word/2010/wordprocessingInk" xmlns:wne="http://schemas.microsoft.com/office/word/2006/wordml" xmlns:wps="http://schemas.microsoft.com/office/word/2010/wordprocessingShape" mc:Ignorable="w14 w15 w16se wp14">
+<w:footnotes xmlns:wpc="http://schemas.microsoft.com/office/word/2010/wordprocessingCanvas" xmlns:cx="http://schemas.microsoft.com/office/drawing/2014/chartex" xmlns:cx1="http://schemas.microsoft.com/office/drawing/2015/9/8/chartex" xmlns:cx2="http://schemas.microsoft.com/office/drawing/2015/10/21/chartex" xmlns:cx3="http://schemas.microsoft.com/office/drawing/2016/5/9/chartex" xmlns:cx4="http://schemas.microsoft.com/office/drawing/2016/5/10/chartex" xmlns:cx5="http://schemas.microsoft.com/office/drawing/2016/5/11/chartex" xmlns:cx6="http://schemas.microsoft.com/office/drawing/2016/5/12/chartex" xmlns:cx7="http://schemas.microsoft.com/office/drawing/2016/5/13/chartex" xmlns:cx8="http://schemas.microsoft.com/office/drawing/2016/5/14/chartex" xmlns:mc="http://schemas.openxmlformats.org/markup-compatibility/2006" xmlns:aink="http://schemas.microsoft.com/office/drawing/2016/ink" xmlns:am3d="http://schemas.microsoft.com/office/drawing/2017/model3d" xmlns:o="urn:schemas-microsoft-com:office:office" xmlns:oel="http://schemas.microsoft.com/office/2019/extlst" xmlns:r="http://schemas.openxmlformats.org/officeDocument/2006/relationships" xmlns:m="http://schemas.openxmlformats.org/officeDocument/2006/math" xmlns:v="urn:schemas-microsoft-com:vml" xmlns:wp14="http://schemas.microsoft.com/office/word/2010/wordprocessingDrawing" xmlns:wp="http://schemas.openxmlformats.org/drawingml/2006/wordprocessingDrawing" xmlns:w10="urn:schemas-microsoft-com:office:word" xmlns:w="http://schemas.openxmlformats.org/wordprocessingml/2006/main" xmlns:w14="http://schemas.microsoft.com/office/word/2010/wordml" xmlns:w15="http://schemas.microsoft.com/office/word/2012/wordml" xmlns:w16cex="http://schemas.microsoft.com/office/word/2018/wordml/cex" xmlns:w16cid="http://schemas.microsoft.com/office/word/2016/wordml/cid" xmlns:w16="http://schemas.microsoft.com/office/word/2018/wordml" xmlns:w16du="http://schemas.microsoft.com/office/word/2023/wordml/word16du" xmlns:w16sdtdh="http://schemas.microsoft.com/office/word/2020/wordml/sdtdatahash" xmlns:w16sdtfl="http://schemas.microsoft.com/office/word/2024/wordml/sdtformatlock" xmlns:w16se="http://schemas.microsoft.com/office/word/2015/wordml/symex" xmlns:wpg="http://schemas.microsoft.com/office/word/2010/wordprocessingGroup" xmlns:wpi="http://schemas.microsoft.com/office/word/2010/wordprocessingInk" xmlns:wne="http://schemas.microsoft.com/office/word/2006/wordml" xmlns:wps="http://schemas.microsoft.com/office/word/2010/wordprocessingShape" mc:Ignorable="w14 w15 w16se w16cid w16 w16cex w16sdtdh w16sdtfl w16du wp14">
   <w:footnote w:type="separator" w:id="-1">
     <w:p>
       <w:r>
@@ -1571,7 +1570,7 @@
 </file>
 
 <file path=word/header1.xml><?xml version="1.0" encoding="utf-8"?>
-<w:hdr xmlns:wpc="http://schemas.microsoft.com/office/word/2010/wordprocessingCanvas" xmlns:cx="http://schemas.microsoft.com/office/drawing/2014/chartex" xmlns:mc="http://schemas.openxmlformats.org/markup-compatibility/2006" xmlns:o="urn:schemas-microsoft-com:office:office" xmlns:r="http://schemas.openxmlformats.org/officeDocument/2006/relationships" xmlns:m="http://schemas.openxmlformats.org/officeDocument/2006/math" xmlns:v="urn:schemas-microsoft-com:vml" xmlns:wp14="http://schemas.microsoft.com/office/word/2010/wordprocessingDrawing" xmlns:wp="http://schemas.openxmlformats.org/drawingml/2006/wordprocessingDrawing" xmlns:w10="urn:schemas-microsoft-com:office:word" xmlns:w="http://schemas.openxmlformats.org/wordprocessingml/2006/main" xmlns:w14="http://schemas.microsoft.com/office/word/2010/wordml" xmlns:w15="http://schemas.microsoft.com/office/word/2012/wordml" xmlns:w16se="http://schemas.microsoft.com/office/word/2015/wordml/symex" xmlns:wpg="http://schemas.microsoft.com/office/word/2010/wordprocessingGroup" xmlns:wpi="http://schemas.microsoft.com/office/word/2010/wordprocessingInk" xmlns:wne="http://schemas.microsoft.com/office/word/2006/wordml" xmlns:wps="http://schemas.microsoft.com/office/word/2010/wordprocessingShape" mc:Ignorable="w14 w15 w16se wp14">
+<w:hdr xmlns:wpc="http://schemas.microsoft.com/office/word/2010/wordprocessingCanvas" xmlns:cx="http://schemas.microsoft.com/office/drawing/2014/chartex" xmlns:cx1="http://schemas.microsoft.com/office/drawing/2015/9/8/chartex" xmlns:cx2="http://schemas.microsoft.com/office/drawing/2015/10/21/chartex" xmlns:cx3="http://schemas.microsoft.com/office/drawing/2016/5/9/chartex" xmlns:cx4="http://schemas.microsoft.com/office/drawing/2016/5/10/chartex" xmlns:cx5="http://schemas.microsoft.com/office/drawing/2016/5/11/chartex" xmlns:cx6="http://schemas.microsoft.com/office/drawing/2016/5/12/chartex" xmlns:cx7="http://schemas.microsoft.com/office/drawing/2016/5/13/chartex" xmlns:cx8="http://schemas.microsoft.com/office/drawing/2016/5/14/chartex" xmlns:mc="http://schemas.openxmlformats.org/markup-compatibility/2006" xmlns:aink="http://schemas.microsoft.com/office/drawing/2016/ink" xmlns:am3d="http://schemas.microsoft.com/office/drawing/2017/model3d" xmlns:o="urn:schemas-microsoft-com:office:office" xmlns:oel="http://schemas.microsoft.com/office/2019/extlst" xmlns:r="http://schemas.openxmlformats.org/officeDocument/2006/relationships" xmlns:m="http://schemas.openxmlformats.org/officeDocument/2006/math" xmlns:v="urn:schemas-microsoft-com:vml" xmlns:wp14="http://schemas.microsoft.com/office/word/2010/wordprocessingDrawing" xmlns:wp="http://schemas.openxmlformats.org/drawingml/2006/wordprocessingDrawing" xmlns:w10="urn:schemas-microsoft-com:office:word" xmlns:w="http://schemas.openxmlformats.org/wordprocessingml/2006/main" xmlns:w14="http://schemas.microsoft.com/office/word/2010/wordml" xmlns:w15="http://schemas.microsoft.com/office/word/2012/wordml" xmlns:w16cex="http://schemas.microsoft.com/office/word/2018/wordml/cex" xmlns:w16cid="http://schemas.microsoft.com/office/word/2016/wordml/cid" xmlns:w16="http://schemas.microsoft.com/office/word/2018/wordml" xmlns:w16du="http://schemas.microsoft.com/office/word/2023/wordml/word16du" xmlns:w16sdtdh="http://schemas.microsoft.com/office/word/2020/wordml/sdtdatahash" xmlns:w16sdtfl="http://schemas.microsoft.com/office/word/2024/wordml/sdtformatlock" xmlns:w16se="http://schemas.microsoft.com/office/word/2015/wordml/symex" xmlns:wpg="http://schemas.microsoft.com/office/word/2010/wordprocessingGroup" xmlns:wpi="http://schemas.microsoft.com/office/word/2010/wordprocessingInk" xmlns:wne="http://schemas.microsoft.com/office/word/2006/wordml" xmlns:wps="http://schemas.microsoft.com/office/word/2010/wordprocessingShape" mc:Ignorable="w14 w15 w16se w16cid w16 w16cex w16sdtdh w16sdtfl w16du wp14">
   <w:tbl>
     <w:tblPr>
       <w:tblW w:w="9957" w:type="dxa"/>
@@ -1864,7 +1863,7 @@
         </mc:Choice>
         <mc:Fallback>
           <w:pict>
-            <v:line w14:anchorId="0F03D3E5" id="Line 416" o:spid="_x0000_s1026" style="position:absolute;z-index:251655168;visibility:visible;mso-wrap-style:square;mso-width-percent:0;mso-height-percent:0;mso-wrap-distance-left:9pt;mso-wrap-distance-top:0;mso-wrap-distance-right:9pt;mso-wrap-distance-bottom:0;mso-position-horizontal:absolute;mso-position-horizontal-relative:margin;mso-position-vertical:absolute;mso-position-vertical-relative:text;mso-width-percent:0;mso-height-percent:0;mso-width-relative:page;mso-height-relative:page" from="0,1.45pt" to="496.05pt,1.45pt" o:gfxdata="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" strokeweight="3.75pt">
+            <v:line w14:anchorId="3B78B003" id="Line 416" o:spid="_x0000_s1026" style="position:absolute;z-index:251655168;visibility:visible;mso-wrap-style:square;mso-width-percent:0;mso-height-percent:0;mso-wrap-distance-left:9pt;mso-wrap-distance-top:0;mso-wrap-distance-right:9pt;mso-wrap-distance-bottom:0;mso-position-horizontal:absolute;mso-position-horizontal-relative:margin;mso-position-vertical:absolute;mso-position-vertical-relative:text;mso-width-percent:0;mso-height-percent:0;mso-width-relative:page;mso-height-relative:page" from="0,1.45pt" to="496.05pt,1.45pt" o:gfxdata="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" strokeweight="3.75pt">
               <v:stroke linestyle="thinThick"/>
               <w10:wrap anchorx="margin"/>
             </v:line>
@@ -1877,7 +1876,7 @@
 </file>
 
 <file path=word/numbering.xml><?xml version="1.0" encoding="utf-8"?>
-<w:numbering xmlns:wpc="http://schemas.microsoft.com/office/word/2010/wordprocessingCanvas" xmlns:cx="http://schemas.microsoft.com/office/drawing/2014/chartex" xmlns:mc="http://schemas.openxmlformats.org/markup-compatibility/2006" xmlns:o="urn:schemas-microsoft-com:office:office" xmlns:r="http://schemas.openxmlformats.org/officeDocument/2006/relationships" xmlns:m="http://schemas.openxmlformats.org/officeDocument/2006/math" xmlns:v="urn:schemas-microsoft-com:vml" xmlns:wp14="http://schemas.microsoft.com/office/word/2010/wordprocessingDrawing" xmlns:wp="http://schemas.openxmlformats.org/drawingml/2006/wordprocessingDrawing" xmlns:w10="urn:schemas-microsoft-com:office:word" xmlns:w="http://schemas.openxmlformats.org/wordprocessingml/2006/main" xmlns:w14="http://schemas.microsoft.com/office/word/2010/wordml" xmlns:w15="http://schemas.microsoft.com/office/word/2012/wordml" xmlns:w16se="http://schemas.microsoft.com/office/word/2015/wordml/symex" xmlns:wpg="http://schemas.microsoft.com/office/word/2010/wordprocessingGroup" xmlns:wpi="http://schemas.microsoft.com/office/word/2010/wordprocessingInk" xmlns:wne="http://schemas.microsoft.com/office/word/2006/wordml" xmlns:wps="http://schemas.microsoft.com/office/word/2010/wordprocessingShape" mc:Ignorable="w14 w15 w16se wp14">
+<w:numbering xmlns:wpc="http://schemas.microsoft.com/office/word/2010/wordprocessingCanvas" xmlns:cx="http://schemas.microsoft.com/office/drawing/2014/chartex" xmlns:cx1="http://schemas.microsoft.com/office/drawing/2015/9/8/chartex" xmlns:cx2="http://schemas.microsoft.com/office/drawing/2015/10/21/chartex" xmlns:cx3="http://schemas.microsoft.com/office/drawing/2016/5/9/chartex" xmlns:cx4="http://schemas.microsoft.com/office/drawing/2016/5/10/chartex" xmlns:cx5="http://schemas.microsoft.com/office/drawing/2016/5/11/chartex" xmlns:cx6="http://schemas.microsoft.com/office/drawing/2016/5/12/chartex" xmlns:cx7="http://schemas.microsoft.com/office/drawing/2016/5/13/chartex" xmlns:cx8="http://schemas.microsoft.com/office/drawing/2016/5/14/chartex" xmlns:mc="http://schemas.openxmlformats.org/markup-compatibility/2006" xmlns:aink="http://schemas.microsoft.com/office/drawing/2016/ink" xmlns:am3d="http://schemas.microsoft.com/office/drawing/2017/model3d" xmlns:o="urn:schemas-microsoft-com:office:office" xmlns:oel="http://schemas.microsoft.com/office/2019/extlst" xmlns:r="http://schemas.openxmlformats.org/officeDocument/2006/relationships" xmlns:m="http://schemas.openxmlformats.org/officeDocument/2006/math" xmlns:v="urn:schemas-microsoft-com:vml" xmlns:wp14="http://schemas.microsoft.com/office/word/2010/wordprocessingDrawing" xmlns:wp="http://schemas.openxmlformats.org/drawingml/2006/wordprocessingDrawing" xmlns:w10="urn:schemas-microsoft-com:office:word" xmlns:w="http://schemas.openxmlformats.org/wordprocessingml/2006/main" xmlns:w14="http://schemas.microsoft.com/office/word/2010/wordml" xmlns:w15="http://schemas.microsoft.com/office/word/2012/wordml" xmlns:w16cex="http://schemas.microsoft.com/office/word/2018/wordml/cex" xmlns:w16cid="http://schemas.microsoft.com/office/word/2016/wordml/cid" xmlns:w16="http://schemas.microsoft.com/office/word/2018/wordml" xmlns:w16du="http://schemas.microsoft.com/office/word/2023/wordml/word16du" xmlns:w16sdtdh="http://schemas.microsoft.com/office/word/2020/wordml/sdtdatahash" xmlns:w16sdtfl="http://schemas.microsoft.com/office/word/2024/wordml/sdtformatlock" xmlns:w16se="http://schemas.microsoft.com/office/word/2015/wordml/symex" xmlns:wpg="http://schemas.microsoft.com/office/word/2010/wordprocessingGroup" xmlns:wpi="http://schemas.microsoft.com/office/word/2010/wordprocessingInk" xmlns:wne="http://schemas.microsoft.com/office/word/2006/wordml" xmlns:wps="http://schemas.microsoft.com/office/word/2010/wordprocessingShape" mc:Ignorable="w14 w15 w16se w16cid w16 w16cex w16sdtdh w16sdtfl w16du wp14">
   <w:abstractNum w:abstractNumId="0" w15:restartNumberingAfterBreak="0">
     <w:nsid w:val="03B60AD1"/>
     <w:multiLevelType w:val="hybridMultilevel"/>
@@ -2124,17 +2123,17 @@
       </w:rPr>
     </w:lvl>
   </w:abstractNum>
-  <w:num w:numId="1">
+  <w:num w:numId="1" w16cid:durableId="551576403">
     <w:abstractNumId w:val="1"/>
   </w:num>
-  <w:num w:numId="2">
+  <w:num w:numId="2" w16cid:durableId="1462310267">
     <w:abstractNumId w:val="0"/>
   </w:num>
 </w:numbering>
 </file>
 
 <file path=word/styles.xml><?xml version="1.0" encoding="utf-8"?>
-<w:styles xmlns:mc="http://schemas.openxmlformats.org/markup-compatibility/2006" xmlns:r="http://schemas.openxmlformats.org/officeDocument/2006/relationships" xmlns:w="http://schemas.openxmlformats.org/wordprocessingml/2006/main" xmlns:w14="http://schemas.microsoft.com/office/word/2010/wordml" xmlns:w15="http://schemas.microsoft.com/office/word/2012/wordml" xmlns:w16se="http://schemas.microsoft.com/office/word/2015/wordml/symex" mc:Ignorable="w14 w15 w16se">
+<w:styles xmlns:mc="http://schemas.openxmlformats.org/markup-compatibility/2006" xmlns:r="http://schemas.openxmlformats.org/officeDocument/2006/relationships" xmlns:w="http://schemas.openxmlformats.org/wordprocessingml/2006/main" xmlns:w14="http://schemas.microsoft.com/office/word/2010/wordml" xmlns:w15="http://schemas.microsoft.com/office/word/2012/wordml" xmlns:w16cex="http://schemas.microsoft.com/office/word/2018/wordml/cex" xmlns:w16cid="http://schemas.microsoft.com/office/word/2016/wordml/cid" xmlns:w16="http://schemas.microsoft.com/office/word/2018/wordml" xmlns:w16du="http://schemas.microsoft.com/office/word/2023/wordml/word16du" xmlns:w16sdtdh="http://schemas.microsoft.com/office/word/2020/wordml/sdtdatahash" xmlns:w16sdtfl="http://schemas.microsoft.com/office/word/2024/wordml/sdtformatlock" xmlns:w16se="http://schemas.microsoft.com/office/word/2015/wordml/symex" mc:Ignorable="w14 w15 w16se w16cid w16 w16cex w16sdtdh w16sdtfl w16du">
   <w:docDefaults>
     <w:rPrDefault>
       <w:rPr>
@@ -2152,7 +2151,7 @@
       </w:pPr>
     </w:pPrDefault>
   </w:docDefaults>
-  <w:latentStyles w:defLockedState="0" w:defUIPriority="99" w:defSemiHidden="0" w:defUnhideWhenUsed="0" w:defQFormat="0" w:count="371">
+  <w:latentStyles w:defLockedState="0" w:defUIPriority="99" w:defSemiHidden="0" w:defUnhideWhenUsed="0" w:defQFormat="0" w:count="376">
     <w:lsdException w:name="Normal" w:uiPriority="0" w:qFormat="1"/>
     <w:lsdException w:name="heading 1" w:uiPriority="9" w:qFormat="1"/>
     <w:lsdException w:name="heading 2" w:semiHidden="1" w:uiPriority="9" w:unhideWhenUsed="1" w:qFormat="1"/>
@@ -2524,6 +2523,11 @@
     <w:lsdException w:name="List Table 5 Dark Accent 6" w:uiPriority="50"/>
     <w:lsdException w:name="List Table 6 Colorful Accent 6" w:uiPriority="51"/>
     <w:lsdException w:name="List Table 7 Colorful Accent 6" w:uiPriority="52"/>
+    <w:lsdException w:name="Mention" w:semiHidden="1" w:unhideWhenUsed="1"/>
+    <w:lsdException w:name="Smart Hyperlink" w:semiHidden="1" w:unhideWhenUsed="1"/>
+    <w:lsdException w:name="Hashtag" w:semiHidden="1" w:unhideWhenUsed="1"/>
+    <w:lsdException w:name="Unresolved Mention" w:semiHidden="1" w:unhideWhenUsed="1"/>
+    <w:lsdException w:name="Smart Link" w:semiHidden="1" w:unhideWhenUsed="1"/>
   </w:latentStyles>
   <w:style w:type="paragraph" w:default="1" w:styleId="Normal">
     <w:name w:val="Normal"/>

</xml_diff>